<commit_message>
Ajusta la corrección del Taller 2 tras el primer lote
- items.json: la Tabla 3 termina antes del recuadro de la hipótesis, para
  que su comentario no quede dentro de otro ítem.
- anotar_pdf: detecta la línea del encabezado y del pie de cada página y
  no escribe comentarios en esas zonas.
- Pauta: agrega los criterios homologados al corregir el primer lote.

Co-Authored-By: Claude Opus 5.5 <noreply@anthropic.com>
Claude-Session: https://claude.ai/code/session_01EwW5SdpFdcaZozTeTFtc6Z
</commit_message>
<xml_diff>
--- a/rototraslacion/pauta/Pauta_Taller2_Rototraslacion.docx
+++ b/rototraslacion/pauta/Pauta_Taller2_Rototraslacion.docx
@@ -2203,6 +2203,359 @@
         <w:pStyle w:val="Heading2"/>
       </w:pPr>
       <w:r>
+        <w:t>Criterios homologados (decididos al corregir el primer lote)</w:t>
+      </w:r>
+    </w:p>
+    <w:tbl>
+      <w:tblPr>
+        <w:tblStyle w:val="TableGrid"/>
+        <w:tblW w:type="auto" w:w="0"/>
+        <w:jc w:val="center"/>
+        <w:tblLook w:firstColumn="1" w:firstRow="1" w:lastColumn="0" w:lastRow="0" w:noHBand="0" w:noVBand="1" w:val="04A0"/>
+      </w:tblPr>
+      <w:tblGrid>
+        <w:gridCol w:w="4986"/>
+        <w:gridCol w:w="4986"/>
+      </w:tblGrid>
+      <w:tr>
+        <w:tc>
+          <w:tcPr>
+            <w:tcW w:type="dxa" w:w="1247"/>
+            <w:shd w:val="clear" w:color="auto" w:fill="D9E2F3"/>
+          </w:tcPr>
+          <w:p>
+            <w:r>
+              <w:rPr>
+                <w:b/>
+                <w:sz w:val="19"/>
+              </w:rPr>
+              <w:t>Situación</w:t>
+            </w:r>
+          </w:p>
+        </w:tc>
+        <w:tc>
+          <w:tcPr>
+            <w:tcW w:type="dxa" w:w="7824"/>
+            <w:shd w:val="clear" w:color="auto" w:fill="D9E2F3"/>
+          </w:tcPr>
+          <w:p>
+            <w:r>
+              <w:rPr>
+                <w:b/>
+                <w:sz w:val="19"/>
+              </w:rPr>
+              <w:t>Criterio</w:t>
+            </w:r>
+          </w:p>
+        </w:tc>
+      </w:tr>
+      <w:tr>
+        <w:tc>
+          <w:tcPr>
+            <w:tcW w:type="dxa" w:w="1247"/>
+          </w:tcPr>
+          <w:p>
+            <w:r>
+              <w:rPr>
+                <w:b w:val="0"/>
+                <w:sz w:val="19"/>
+              </w:rPr>
+              <w:t>Rapidez calculada como v = 2·d/t (o d/t) en vez de derivar d(t)</w:t>
+            </w:r>
+          </w:p>
+        </w:tc>
+        <w:tc>
+          <w:tcPr>
+            <w:tcW w:type="dxa" w:w="7824"/>
+          </w:tcPr>
+          <w:p>
+            <w:r>
+              <w:rPr>
+                <w:b w:val="0"/>
+                <w:sz w:val="19"/>
+              </w:rPr>
+              <w:t>0/2 en el criterio de rapidez de la Tabla 3 (confirmado por el docente: el taller pide derivar). Los ítems siguientes se corrigen con sus valores.</w:t>
+            </w:r>
+          </w:p>
+        </w:tc>
+      </w:tr>
+      <w:tr>
+        <w:tc>
+          <w:tcPr>
+            <w:tcW w:type="dxa" w:w="1247"/>
+          </w:tcPr>
+          <w:p>
+            <w:r>
+              <w:rPr>
+                <w:b w:val="0"/>
+                <w:sz w:val="19"/>
+              </w:rPr>
+              <w:t>d(t): datos bien ubicados pero rótulos de los ejes intercambiados</w:t>
+            </w:r>
+          </w:p>
+        </w:tc>
+        <w:tc>
+          <w:tcPr>
+            <w:tcW w:type="dxa" w:w="7824"/>
+          </w:tcPr>
+          <w:p>
+            <w:r>
+              <w:rPr>
+                <w:b w:val="0"/>
+                <w:sz w:val="19"/>
+              </w:rPr>
+              <w:t>2/3 en el criterio del gráfico.</w:t>
+            </w:r>
+          </w:p>
+        </w:tc>
+      </w:tr>
+      <w:tr>
+        <w:tc>
+          <w:tcPr>
+            <w:tcW w:type="dxa" w:w="1247"/>
+          </w:tcPr>
+          <w:p>
+            <w:r>
+              <w:rPr>
+                <w:b w:val="0"/>
+                <w:sz w:val="19"/>
+              </w:rPr>
+              <w:t>d(t): ejes invertidos (t en el eje Y)</w:t>
+            </w:r>
+          </w:p>
+        </w:tc>
+        <w:tc>
+          <w:tcPr>
+            <w:tcW w:type="dxa" w:w="7824"/>
+          </w:tcPr>
+          <w:p>
+            <w:r>
+              <w:rPr>
+                <w:b w:val="0"/>
+                <w:sz w:val="19"/>
+              </w:rPr>
+              <w:t>1/3 en el criterio del gráfico; si la ecuación es t(d) y no d(t), 0/3 en la ecuación.</w:t>
+            </w:r>
+          </w:p>
+        </w:tc>
+      </w:tr>
+      <w:tr>
+        <w:tc>
+          <w:tcPr>
+            <w:tcW w:type="dxa" w:w="1247"/>
+          </w:tcPr>
+          <w:p>
+            <w:r>
+              <w:rPr>
+                <w:b w:val="0"/>
+                <w:sz w:val="19"/>
+              </w:rPr>
+              <w:t>Ecuación escrita sin unidades o con "x" en vez de t</w:t>
+            </w:r>
+          </w:p>
+        </w:tc>
+        <w:tc>
+          <w:tcPr>
+            <w:tcW w:type="dxa" w:w="7824"/>
+          </w:tcPr>
+          <w:p>
+            <w:r>
+              <w:rPr>
+                <w:b w:val="0"/>
+                <w:sz w:val="19"/>
+              </w:rPr>
+              <w:t>2/3 en el criterio de la ecuación (un solo descuento aunque falten ambas cosas).</w:t>
+            </w:r>
+          </w:p>
+        </w:tc>
+      </w:tr>
+      <w:tr>
+        <w:tc>
+          <w:tcPr>
+            <w:tcW w:type="dxa" w:w="1247"/>
+          </w:tcPr>
+          <w:p>
+            <w:r>
+              <w:rPr>
+                <w:b w:val="0"/>
+                <w:sz w:val="19"/>
+              </w:rPr>
+              <w:t>Gráfico sin leyenda y/o sin unidades en los ejes</w:t>
+            </w:r>
+          </w:p>
+        </w:tc>
+        <w:tc>
+          <w:tcPr>
+            <w:tcW w:type="dxa" w:w="7824"/>
+          </w:tcPr>
+          <w:p>
+            <w:r>
+              <w:rPr>
+                <w:b w:val="0"/>
+                <w:sz w:val="19"/>
+              </w:rPr>
+              <w:t>Mitad del criterio del gráfico (3/6).</w:t>
+            </w:r>
+          </w:p>
+        </w:tc>
+      </w:tr>
+      <w:tr>
+        <w:tc>
+          <w:tcPr>
+            <w:tcW w:type="dxa" w:w="1247"/>
+          </w:tcPr>
+          <w:p>
+            <w:r>
+              <w:rPr>
+                <w:b w:val="0"/>
+                <w:sz w:val="19"/>
+              </w:rPr>
+              <w:t>Eje X del gráfico de energías con el número de medición en vez de d</w:t>
+            </w:r>
+          </w:p>
+        </w:tc>
+        <w:tc>
+          <w:tcPr>
+            <w:tcW w:type="dxa" w:w="7824"/>
+          </w:tcPr>
+          <w:p>
+            <w:r>
+              <w:rPr>
+                <w:b w:val="0"/>
+                <w:sz w:val="19"/>
+              </w:rPr>
+              <w:t>4/6 en el criterio del gráfico.</w:t>
+            </w:r>
+          </w:p>
+        </w:tc>
+      </w:tr>
+      <w:tr>
+        <w:tc>
+          <w:tcPr>
+            <w:tcW w:type="dxa" w:w="1247"/>
+          </w:tcPr>
+          <w:p>
+            <w:r>
+              <w:rPr>
+                <w:b w:val="0"/>
+                <w:sz w:val="19"/>
+              </w:rPr>
+              <w:t>Gráfico de K_Tot, U_g y E_mec sin ninguna línea de tendencia</w:t>
+            </w:r>
+          </w:p>
+        </w:tc>
+        <w:tc>
+          <w:tcPr>
+            <w:tcW w:type="dxa" w:w="7824"/>
+          </w:tcPr>
+          <w:p>
+            <w:r>
+              <w:rPr>
+                <w:b w:val="0"/>
+                <w:sz w:val="19"/>
+              </w:rPr>
+              <w:t>0/4 en ajustes (el parcial de 2 es para ajustes no lineales o sin ecuación).</w:t>
+            </w:r>
+          </w:p>
+        </w:tc>
+      </w:tr>
+      <w:tr>
+        <w:tc>
+          <w:tcPr>
+            <w:tcW w:type="dxa" w:w="1247"/>
+          </w:tcPr>
+          <w:p>
+            <w:r>
+              <w:rPr>
+                <w:b w:val="0"/>
+                <w:sz w:val="19"/>
+              </w:rPr>
+              <w:t>Promedio y error con distinto número de decimales</w:t>
+            </w:r>
+          </w:p>
+        </w:tc>
+        <w:tc>
+          <w:tcPr>
+            <w:tcW w:type="dxa" w:w="7824"/>
+          </w:tcPr>
+          <w:p>
+            <w:r>
+              <w:rPr>
+                <w:b w:val="0"/>
+                <w:sz w:val="19"/>
+              </w:rPr>
+              <w:t>1/2 en el criterio de expresión del resultado.</w:t>
+            </w:r>
+          </w:p>
+        </w:tc>
+      </w:tr>
+      <w:tr>
+        <w:tc>
+          <w:tcPr>
+            <w:tcW w:type="dxa" w:w="1247"/>
+          </w:tcPr>
+          <w:p>
+            <w:r>
+              <w:rPr>
+                <w:b w:val="0"/>
+                <w:sz w:val="19"/>
+              </w:rPr>
+              <w:t>Altura medida hacia abajo desde el inicio (U_g crece al bajar)</w:t>
+            </w:r>
+          </w:p>
+        </w:tc>
+        <w:tc>
+          <w:tcPr>
+            <w:tcW w:type="dxa" w:w="7824"/>
+          </w:tcPr>
+          <w:p>
+            <w:r>
+              <w:rPr>
+                <w:b w:val="0"/>
+                <w:sz w:val="19"/>
+              </w:rPr>
+              <w:t>1/2 en el criterio de alturas; el análisis que no lo detecta se descuenta en el ítem de energías.</w:t>
+            </w:r>
+          </w:p>
+        </w:tc>
+      </w:tr>
+      <w:tr>
+        <w:tc>
+          <w:tcPr>
+            <w:tcW w:type="dxa" w:w="1247"/>
+          </w:tcPr>
+          <w:p>
+            <w:r>
+              <w:rPr>
+                <w:b w:val="0"/>
+                <w:sz w:val="19"/>
+              </w:rPr>
+              <w:t>Nota</w:t>
+            </w:r>
+          </w:p>
+        </w:tc>
+        <w:tc>
+          <w:tcPr>
+            <w:tcW w:type="dxa" w:w="7824"/>
+          </w:tcPr>
+          <w:p>
+            <w:r>
+              <w:rPr>
+                <w:b w:val="0"/>
+                <w:sz w:val="19"/>
+              </w:rPr>
+              <w:t>Se redondea a un decimal hacia arriba desde 0,05 (5,35 → 5,4).</w:t>
+            </w:r>
+          </w:p>
+        </w:tc>
+      </w:tr>
+    </w:tbl>
+    <w:p/>
+    <w:p>
+      <w:pPr>
+        <w:pStyle w:val="Heading2"/>
+      </w:pPr>
+      <w:r>
         <w:t>Formato del informe de revisión</w:t>
       </w:r>
     </w:p>

</xml_diff>